<commit_message>
Fix formatting requirements: main title (Fangzheng Xiaobiaosong/HeiTi, size 16, center), level-1 (HeiTi size 10.5), level-2 (KaiTi size 10.5), body (FangSong size 10.5, line spacing 28pt, indent 2 chars), figure/table captions (center, size <= body)
Co-authored-by: arena-agent <297053741+arena-agent@users.noreply.github.com>
</commit_message>
<xml_diff>
--- a/河北省财经行业产教融合共同体典型案例征集通知/案例输出/高职专科-石家庄邮电职业技术学院-AI赋能、产教融合——财税知识库协同育人实践-V1.2.docx
+++ b/河北省财经行业产教融合共同体典型案例征集通知/案例输出/高职专科-石家庄邮电职业技术学院-AI赋能、产教融合——财税知识库协同育人实践-V1.2.docx
@@ -113,7 +113,7 @@
       </w:pPr>
       <w:r>
         <w:rPr>
-          <w:rFonts w:ascii="黑体" w:hAnsi="黑体" w:eastAsia="黑体"/>
+          <w:rFonts w:ascii="方正小标宋简体" w:hAnsi="方正小标宋简体" w:eastAsia="方正小标宋简体"/>
           <w:sz w:val="32"/>
         </w:rPr>
         <w:t>河北省财经行业产教融合共同体典型案例</w:t>
@@ -125,7 +125,7 @@
       </w:pPr>
       <w:r>
         <w:rPr>
-          <w:rFonts w:ascii="黑体" w:hAnsi="黑体" w:eastAsia="黑体"/>
+          <w:rFonts w:ascii="方正小标宋简体" w:hAnsi="方正小标宋简体" w:eastAsia="方正小标宋简体"/>
           <w:sz w:val="32"/>
         </w:rPr>
         <w:t>——AI赋能、产教融合：财税知识库协同育人实践（石家庄邮电职业技术学院）</w:t>
@@ -251,7 +251,7 @@
       <w:r>
         <w:rPr>
           <w:rFonts w:ascii="仿宋_GB2312" w:hAnsi="仿宋_GB2312" w:eastAsia="仿宋_GB2312"/>
-          <w:sz w:val="21"/>
+          <w:sz w:val="18"/>
         </w:rPr>
         <w:t>图1  教师赴河北企富财税管理有限公司与企业团队座谈调研（2026年7月）</w:t>
       </w:r>
@@ -264,7 +264,7 @@
       <w:r>
         <w:rPr>
           <w:rFonts w:ascii="仿宋_GB2312" w:hAnsi="仿宋_GB2312" w:eastAsia="仿宋_GB2312"/>
-          <w:sz w:val="21"/>
+          <w:sz w:val="18"/>
         </w:rPr>
         <w:t>图2  座谈调研现场：企业部门骨干介绍业务流程与政策使用场景</w:t>
       </w:r>
@@ -291,7 +291,7 @@
       <w:r>
         <w:rPr>
           <w:rFonts w:ascii="仿宋_GB2312" w:hAnsi="仿宋_GB2312" w:eastAsia="仿宋_GB2312"/>
-          <w:sz w:val="21"/>
+          <w:sz w:val="18"/>
         </w:rPr>
         <w:t>图3  “0730资料库”AI检索界面实测：库外问题（天津市医保报销比例）准确识别、不作编造</w:t>
       </w:r>
@@ -318,7 +318,7 @@
       <w:r>
         <w:rPr>
           <w:rFonts w:ascii="仿宋_GB2312" w:hAnsi="仿宋_GB2312" w:eastAsia="仿宋_GB2312"/>
-          <w:sz w:val="21"/>
+          <w:sz w:val="18"/>
         </w:rPr>
         <w:t>图4  知识库单点细节检索测试：精准引用《党政机关国内公务接待管理规定》给出结构化答复</w:t>
       </w:r>
@@ -368,7 +368,7 @@
       <w:r>
         <w:rPr>
           <w:rFonts w:ascii="仿宋_GB2312" w:hAnsi="仿宋_GB2312" w:eastAsia="仿宋_GB2312"/>
-          <w:sz w:val="21"/>
+          <w:sz w:val="18"/>
         </w:rPr>
         <w:t>图4  知识库单点细节检索测试：精准引用《党政机关国内公务接待管理规定》给出结构化答复</w:t>
       </w:r>
@@ -418,7 +418,7 @@
       <w:r>
         <w:rPr>
           <w:rFonts w:ascii="仿宋_GB2312" w:hAnsi="仿宋_GB2312" w:eastAsia="仿宋_GB2312"/>
-          <w:sz w:val="21"/>
+          <w:sz w:val="18"/>
         </w:rPr>
         <w:t>图5  教师指导毕设小组对接企业需求、开展财税法规知识库标签体系构建（2026年10月）</w:t>
       </w:r>

</xml_diff>